<commit_message>
Tier-0 audit: the lifecycle and edge-case phases, and fixture photographs the classifier accepts
stock-tier0-lifecycle follows one list through publication, both UIs in a
real browser, a Command Centre activation through select_for_client, the
portal acknowledgement, a v2 re-upload, the builder's own edits, a second
organisation with the same estate and lot, a deleted list and a withdrawn
activation. stock-tier0-edges covers refused, malformed, partial,
duplicate, unusual, Unicode and oversized input and the upload-flow clicks.

The fixtures' facade photographs are now only seeds the product's own
assessMarketplaceEligibility accepts, measured on the exact bytes each
format embeds; the first run showed three of the old seeds refused as
marketing tiles, which made the run a statement about the fixture.

Co-Authored-By: Claude Opus 5.5 <noreply@anthropic.com>
Claude-Session: https://claude.ai/code/session_018BjHXw6oqXMjrQzqoMowt6
</commit_message>
<xml_diff>
--- a/scripts/ops/fixtures/tier0/docx.docx
+++ b/scripts/ops/fixtures/tier0/docx.docx
@@ -464,7 +464,7 @@
                     <a:graphicData uri="http://schemas.openxmlformats.org/drawingml/2006/picture">
                       <pic:pic>
                         <pic:nvPicPr>
-                          <pic:cNvPr id="0" name="facade-401.jpg"/>
+                          <pic:cNvPr id="0" name="facade-407.jpg"/>
                           <pic:cNvPicPr/>
                         </pic:nvPicPr>
                         <pic:blipFill>
@@ -703,7 +703,7 @@
                     <a:graphicData uri="http://schemas.openxmlformats.org/drawingml/2006/picture">
                       <pic:pic>
                         <pic:nvPicPr>
-                          <pic:cNvPr id="0" name="facade-402.jpg"/>
+                          <pic:cNvPr id="0" name="facade-413.jpg"/>
                           <pic:cNvPicPr/>
                         </pic:nvPicPr>
                         <pic:blipFill>

</xml_diff>